<commit_message>
docs: update system design documentation, surveillance cycle diagrams, and anti-slop audits
</commit_message>
<xml_diff>
--- a/docs/DOKUMENTASI_ARSITEKTUR_APLIKASI.docx
+++ b/docs/DOKUMENTASI_ARSITEKTUR_APLIKASI.docx
@@ -1,6 +1,6 @@
 
 <file path=word/document.xml><?xml version="1.0" encoding="utf-8"?>
-<w:document xmlns:w="http://schemas.openxmlformats.org/wordprocessingml/2006/main" xmlns:r="http://schemas.openxmlformats.org/officeDocument/2006/relationships">
+<w:document xmlns:a="http://schemas.openxmlformats.org/drawingml/2006/main" xmlns:pic="http://schemas.openxmlformats.org/drawingml/2006/picture" xmlns:r="http://schemas.openxmlformats.org/officeDocument/2006/relationships" xmlns:w="http://schemas.openxmlformats.org/wordprocessingml/2006/main" xmlns:wp="http://schemas.openxmlformats.org/drawingml/2006/wordprocessingDrawing">
   <w:body>
     <w:p>
       <w:pPr>
@@ -1585,22 +1585,22 @@
       </w:pPr>
       <w:r>
         <w:drawing>
-          <wp:inline xmlns:wp="http://schemas.openxmlformats.org/drawingml/2006/wordprocessingDrawing" distT="0" distB="0" distL="0" distR="0">
+          <wp:inline distT="0" distB="0" distL="0" distR="0">
             <wp:extent cx="5600000" cy="1849000"/>
             <wp:effectExtent l="0" t="0" r="0" b="0"/>
             <wp:docPr id="1" name="Gambar 4. 1 Struktur Navigasi Ketua Tim (Admin Unit Akreditasi)"/>
             <wp:cNvGraphicFramePr>
-              <a:graphicFrameLocks xmlns:a="http://schemas.openxmlformats.org/drawingml/2006/main" noChangeAspect="1"/>
+              <a:graphicFrameLocks noChangeAspect="1"/>
             </wp:cNvGraphicFramePr>
-            <a:graphic xmlns:a="http://schemas.openxmlformats.org/drawingml/2006/main">
+            <a:graphic>
               <a:graphicData uri="http://schemas.openxmlformats.org/drawingml/2006/picture">
-                <pic:pic xmlns:pic="http://schemas.openxmlformats.org/drawingml/2006/picture">
+                <pic:pic>
                   <pic:nvPicPr>
                     <pic:cNvPr id="0" name="nav_admin.png"/>
                     <pic:cNvPicPr/>
                   </pic:nvPicPr>
                   <pic:blipFill>
-                    <a:blip xmlns:r="http://schemas.openxmlformats.org/officeDocument/2006/relationships" r:embed="rIdImg1"/>
+                    <a:blip r:embed="rIdImg1"/>
                     <a:stretch>
                       <a:fillRect/>
                     </a:stretch>
@@ -1673,22 +1673,22 @@
       </w:pPr>
       <w:r>
         <w:drawing>
-          <wp:inline xmlns:wp="http://schemas.openxmlformats.org/drawingml/2006/wordprocessingDrawing" distT="0" distB="0" distL="0" distR="0">
+          <wp:inline distT="0" distB="0" distL="0" distR="0">
             <wp:extent cx="5400000" cy="2147000"/>
             <wp:effectExtent l="0" t="0" r="0" b="0"/>
             <wp:docPr id="2" name="Gambar 4. 2 Struktur Navigasi PIC Laboratorium"/>
             <wp:cNvGraphicFramePr>
-              <a:graphicFrameLocks xmlns:a="http://schemas.openxmlformats.org/drawingml/2006/main" noChangeAspect="1"/>
+              <a:graphicFrameLocks noChangeAspect="1"/>
             </wp:cNvGraphicFramePr>
-            <a:graphic xmlns:a="http://schemas.openxmlformats.org/drawingml/2006/main">
+            <a:graphic>
               <a:graphicData uri="http://schemas.openxmlformats.org/drawingml/2006/picture">
-                <pic:pic xmlns:pic="http://schemas.openxmlformats.org/drawingml/2006/picture">
+                <pic:pic>
                   <pic:nvPicPr>
                     <pic:cNvPr id="0" name="nav_pic.png"/>
                     <pic:cNvPicPr/>
                   </pic:nvPicPr>
                   <pic:blipFill>
-                    <a:blip xmlns:r="http://schemas.openxmlformats.org/officeDocument/2006/relationships" r:embed="rIdImg2"/>
+                    <a:blip r:embed="rIdImg2"/>
                     <a:stretch>
                       <a:fillRect/>
                     </a:stretch>
@@ -1799,22 +1799,22 @@
       </w:pPr>
       <w:r>
         <w:drawing>
-          <wp:inline xmlns:wp="http://schemas.openxmlformats.org/drawingml/2006/wordprocessingDrawing" distT="0" distB="0" distL="0" distR="0">
+          <wp:inline distT="0" distB="0" distL="0" distR="0">
             <wp:extent cx="4800000" cy="4742000"/>
             <wp:effectExtent l="0" t="0" r="0" b="0"/>
             <wp:docPr id="3" name="Gambar 5. 1 Use Case Diagram Ketua Tim (Admin Unit)"/>
             <wp:cNvGraphicFramePr>
-              <a:graphicFrameLocks xmlns:a="http://schemas.openxmlformats.org/drawingml/2006/main" noChangeAspect="1"/>
+              <a:graphicFrameLocks noChangeAspect="1"/>
             </wp:cNvGraphicFramePr>
-            <a:graphic xmlns:a="http://schemas.openxmlformats.org/drawingml/2006/main">
+            <a:graphic>
               <a:graphicData uri="http://schemas.openxmlformats.org/drawingml/2006/picture">
-                <pic:pic xmlns:pic="http://schemas.openxmlformats.org/drawingml/2006/picture">
+                <pic:pic>
                   <pic:nvPicPr>
                     <pic:cNvPr id="0" name="usecase_admin.png"/>
                     <pic:cNvPicPr/>
                   </pic:nvPicPr>
                   <pic:blipFill>
-                    <a:blip xmlns:r="http://schemas.openxmlformats.org/officeDocument/2006/relationships" r:embed="rIdImg3"/>
+                    <a:blip r:embed="rIdImg3"/>
                     <a:stretch>
                       <a:fillRect/>
                     </a:stretch>
@@ -2847,22 +2847,22 @@
       </w:pPr>
       <w:r>
         <w:drawing>
-          <wp:inline xmlns:wp="http://schemas.openxmlformats.org/drawingml/2006/wordprocessingDrawing" distT="0" distB="0" distL="0" distR="0">
+          <wp:inline distT="0" distB="0" distL="0" distR="0">
             <wp:extent cx="4800000" cy="4448000"/>
             <wp:effectExtent l="0" t="0" r="0" b="0"/>
             <wp:docPr id="4" name="Gambar 5. 2 Use Case Diagram PIC Laboratorium"/>
             <wp:cNvGraphicFramePr>
-              <a:graphicFrameLocks xmlns:a="http://schemas.openxmlformats.org/drawingml/2006/main" noChangeAspect="1"/>
+              <a:graphicFrameLocks noChangeAspect="1"/>
             </wp:cNvGraphicFramePr>
-            <a:graphic xmlns:a="http://schemas.openxmlformats.org/drawingml/2006/main">
+            <a:graphic>
               <a:graphicData uri="http://schemas.openxmlformats.org/drawingml/2006/picture">
-                <pic:pic xmlns:pic="http://schemas.openxmlformats.org/drawingml/2006/picture">
+                <pic:pic>
                   <pic:nvPicPr>
                     <pic:cNvPr id="0" name="usecase_pic.png"/>
                     <pic:cNvPicPr/>
                   </pic:nvPicPr>
                   <pic:blipFill>
-                    <a:blip xmlns:r="http://schemas.openxmlformats.org/officeDocument/2006/relationships" r:embed="rIdImg4"/>
+                    <a:blip r:embed="rIdImg4"/>
                     <a:stretch>
                       <a:fillRect/>
                     </a:stretch>
@@ -3762,22 +3762,22 @@
       </w:pPr>
       <w:r>
         <w:drawing>
-          <wp:inline xmlns:wp="http://schemas.openxmlformats.org/drawingml/2006/wordprocessingDrawing" distT="0" distB="0" distL="0" distR="0">
+          <wp:inline distT="0" distB="0" distL="0" distR="0">
             <wp:extent cx="5600000" cy="2281000"/>
             <wp:effectExtent l="0" t="0" r="0" b="0"/>
             <wp:docPr id="5" name="Gambar 6. 1 Matriks Siklus Pengawasan Akreditasi KAN (5 Tahun / 60 Bulan)"/>
             <wp:cNvGraphicFramePr>
-              <a:graphicFrameLocks xmlns:a="http://schemas.openxmlformats.org/drawingml/2006/main" noChangeAspect="1"/>
+              <a:graphicFrameLocks noChangeAspect="1"/>
             </wp:cNvGraphicFramePr>
-            <a:graphic xmlns:a="http://schemas.openxmlformats.org/drawingml/2006/main">
+            <a:graphic>
               <a:graphicData uri="http://schemas.openxmlformats.org/drawingml/2006/picture">
-                <pic:pic xmlns:pic="http://schemas.openxmlformats.org/drawingml/2006/picture">
+                <pic:pic>
                   <pic:nvPicPr>
                     <pic:cNvPr id="0" name="diagram_siklus_pengawasan.png"/>
                     <pic:cNvPicPr/>
                   </pic:nvPicPr>
                   <pic:blipFill>
-                    <a:blip xmlns:r="http://schemas.openxmlformats.org/officeDocument/2006/relationships" r:embed="rIdImg5"/>
+                    <a:blip r:embed="rIdImg5"/>
                     <a:stretch>
                       <a:fillRect/>
                     </a:stretch>
@@ -4032,15 +4032,12 @@
             </w:tcMar>
           </w:tcPr>
           <w:p>
-            <w:pPr>
-              <w:jc w:val="center"/>
-              <w:spacing w:before="0" w:after="0" w:line="240" w:lineRule="auto"/>
-            </w:pPr>
-            <w:r>
-              <w:rPr>
-                <w:rFonts w:ascii="Calibri" w:hAnsi="Calibri"/>
-                <w:color w:val="000000"/>
-                <w:sz w:val="18"/>
+            <w:pPr/>
+            <w:r>
+              <w:rPr>
+                <w:b/>
+                <w:rFonts w:ascii="Arial" w:hAnsi="Arial"/>
+                <w:sz w:val="19"/>
               </w:rPr>
               <w:t>Surveilen 1 (S1)</w:t>
             </w:r>
@@ -4048,6 +4045,60 @@
         </w:tc>
         <w:tc>
           <w:tcPr>
+            <w:tcW w:w="1800" w:type="dxa"/>
+            <w:shd w:val="clear" w:color="auto" w:fill="FFFFFF"/>
+            <w:tcMar>
+              <w:top w:w="100" w:type="dxa"/>
+              <w:bottom w:w="100" w:type="dxa"/>
+              <w:left w:w="140" w:type="dxa"/>
+              <w:right w:w="140" w:type="dxa"/>
+            </w:tcMar>
+          </w:tcPr>
+          <w:p>
+            <w:pPr/>
+            <w:r>
+              <w:rPr>
+                <w:rFonts w:ascii="Arial" w:hAnsi="Arial"/>
+                <w:sz w:val="19"/>
+              </w:rPr>
+              <w:t>Tanggal Penetapan Sertifikat (certificate_date / Bulan 0)</w:t>
+            </w:r>
+          </w:p>
+        </w:tc>
+        <w:tc>
+          <w:tcPr>
+            <w:tcW w:w="1500" w:type="dxa"/>
+            <w:shd w:val="clear" w:color="auto" w:fill="FFFFFF"/>
+            <w:tcMar>
+              <w:top w:w="100" w:type="dxa"/>
+              <w:bottom w:w="100" w:type="dxa"/>
+              <w:left w:w="140" w:type="dxa"/>
+              <w:right w:w="140" w:type="dxa"/>
+            </w:tcMar>
+          </w:tcPr>
+          <w:p>
+            <w:pPr/>
+            <w:r>
+              <w:rPr>
+                <w:rFonts w:ascii="Arial" w:hAnsi="Arial"/>
+                <w:sz w:val="19"/>
+              </w:rPr>
+              <w:t>Bulan ke-13 s/d 14</w:t>
+            </w:r>
+          </w:p>
+          <w:p>
+            <w:pPr/>
+            <w:r>
+              <w:rPr>
+                <w:rFonts w:ascii="Arial" w:hAnsi="Arial"/>
+                <w:sz w:val="19"/>
+              </w:rPr>
+              <w:t>(H-2 bln pengingat awal &amp; email aktif)</w:t>
+            </w:r>
+          </w:p>
+        </w:tc>
+        <w:tc>
+          <w:tcPr>
             <w:tcW w:w="1600" w:type="dxa"/>
             <w:shd w:val="clear" w:color="auto" w:fill="FFFFFF"/>
             <w:tcMar>
@@ -4058,123 +4109,77 @@
             </w:tcMar>
           </w:tcPr>
           <w:p>
-            <w:pPr>
-              <w:jc w:val="left"/>
-              <w:spacing w:before="0" w:after="0" w:line="240" w:lineRule="auto"/>
-            </w:pPr>
-            <w:r>
-              <w:rPr>
-                <w:rFonts w:ascii="Calibri" w:hAnsi="Calibri"/>
-                <w:color w:val="000000"/>
-                <w:sz w:val="18"/>
-              </w:rPr>
-              <w:t>Tanggal Penetapan Sertifikat (certificate_date)</w:t>
-            </w:r>
-          </w:p>
-        </w:tc>
-        <w:tc>
-          <w:tcPr>
-            <w:tcW w:w="1500" w:type="dxa"/>
-            <w:shd w:val="clear" w:color="auto" w:fill="FFFFFF"/>
-            <w:tcMar>
-              <w:top w:w="100" w:type="dxa"/>
-              <w:bottom w:w="100" w:type="dxa"/>
-              <w:left w:w="140" w:type="dxa"/>
-              <w:right w:w="140" w:type="dxa"/>
-            </w:tcMar>
-          </w:tcPr>
-          <w:p>
-            <w:pPr>
-              <w:jc w:val="left"/>
-              <w:spacing w:before="0" w:after="0" w:line="240" w:lineRule="auto"/>
-            </w:pPr>
-            <w:r>
-              <w:rPr>
-                <w:rFonts w:ascii="Calibri" w:hAnsi="Calibri"/>
-                <w:color w:val="000000"/>
-                <w:sz w:val="18"/>
-              </w:rPr>
-              <w:t>Bulan ke-14
-(H-1 Bulan)</w:t>
-            </w:r>
-          </w:p>
-        </w:tc>
-        <w:tc>
-          <w:tcPr>
-            <w:tcW w:w="1500" w:type="dxa"/>
-            <w:shd w:val="clear" w:color="auto" w:fill="FFFFFF"/>
-            <w:tcMar>
-              <w:top w:w="100" w:type="dxa"/>
-              <w:bottom w:w="100" w:type="dxa"/>
-              <w:left w:w="140" w:type="dxa"/>
-              <w:right w:w="140" w:type="dxa"/>
-            </w:tcMar>
-          </w:tcPr>
-          <w:p>
-            <w:pPr>
-              <w:jc w:val="center"/>
-              <w:spacing w:before="0" w:after="0" w:line="240" w:lineRule="auto"/>
-            </w:pPr>
-            <w:r>
-              <w:rPr>
-                <w:rFonts w:ascii="Calibri" w:hAnsi="Calibri"/>
-                <w:color w:val="000000"/>
-                <w:sz w:val="18"/>
+            <w:pPr/>
+            <w:r>
+              <w:rPr>
+                <w:rFonts w:ascii="Arial" w:hAnsi="Arial"/>
+                <w:sz w:val="19"/>
               </w:rPr>
               <w:t>Bulan ke-15 s/d Bulan ke-18</w:t>
             </w:r>
           </w:p>
-        </w:tc>
-        <w:tc>
-          <w:tcPr>
-            <w:tcW w:w="1500" w:type="dxa"/>
-            <w:shd w:val="clear" w:color="auto" w:fill="FFFFFF"/>
-            <w:tcMar>
-              <w:top w:w="100" w:type="dxa"/>
-              <w:bottom w:w="100" w:type="dxa"/>
-              <w:left w:w="140" w:type="dxa"/>
-              <w:right w:w="140" w:type="dxa"/>
-            </w:tcMar>
-          </w:tcPr>
-          <w:p>
-            <w:pPr>
-              <w:jc w:val="left"/>
-              <w:spacing w:before="0" w:after="0" w:line="240" w:lineRule="auto"/>
-            </w:pPr>
-            <w:r>
-              <w:rPr>
-                <w:rFonts w:ascii="Calibri" w:hAnsi="Calibri"/>
-                <w:color w:val="000000"/>
-                <w:sz w:val="18"/>
-              </w:rPr>
-              <w:t>Maksimal Bulan ke-19
-(Bln 15 + 4 Bulan)</w:t>
-            </w:r>
-          </w:p>
-        </w:tc>
-        <w:tc>
-          <w:tcPr>
-            <w:tcW w:w="1500" w:type="dxa"/>
-            <w:shd w:val="clear" w:color="auto" w:fill="FFFFFF"/>
-            <w:tcMar>
-              <w:top w:w="100" w:type="dxa"/>
-              <w:bottom w:w="100" w:type="dxa"/>
-              <w:left w:w="140" w:type="dxa"/>
-              <w:right w:w="140" w:type="dxa"/>
-            </w:tcMar>
-          </w:tcPr>
-          <w:p>
-            <w:pPr>
-              <w:jc w:val="left"/>
-              <w:spacing w:before="0" w:after="0" w:line="240" w:lineRule="auto"/>
-            </w:pPr>
-            <w:r>
-              <w:rPr>
-                <w:rFonts w:ascii="Calibri" w:hAnsi="Calibri"/>
-                <w:color w:val="000000"/>
-                <w:sz w:val="18"/>
-              </w:rPr>
-              <w:t>Evaluasi tahun pertama kepatuhan standar ISO/IEC 17025. Peringatan otomatis dinonaktifkan jika asesmen S1 terlaksana.</w:t>
+          <w:p>
+            <w:pPr/>
+            <w:r>
+              <w:rPr>
+                <w:rFonts w:ascii="Arial" w:hAnsi="Arial"/>
+                <w:sz w:val="19"/>
+              </w:rPr>
+              <w:t>(Target Kunjungan Normal S1)</w:t>
+            </w:r>
+          </w:p>
+        </w:tc>
+        <w:tc>
+          <w:tcPr>
+            <w:tcW w:w="1600" w:type="dxa"/>
+            <w:shd w:val="clear" w:color="auto" w:fill="FFFFFF"/>
+            <w:tcMar>
+              <w:top w:w="100" w:type="dxa"/>
+              <w:bottom w:w="100" w:type="dxa"/>
+              <w:left w:w="140" w:type="dxa"/>
+              <w:right w:w="140" w:type="dxa"/>
+            </w:tcMar>
+          </w:tcPr>
+          <w:p>
+            <w:pPr/>
+            <w:r>
+              <w:rPr>
+                <w:rFonts w:ascii="Arial" w:hAnsi="Arial"/>
+                <w:sz w:val="19"/>
+              </w:rPr>
+              <w:t>Maksimal Bulan ke-24</w:t>
+            </w:r>
+          </w:p>
+          <w:p>
+            <w:pPr/>
+            <w:r>
+              <w:rPr>
+                <w:rFonts w:ascii="Arial" w:hAnsi="Arial"/>
+                <w:sz w:val="19"/>
+              </w:rPr>
+              <w:t>(Tepat 2 Tahun Sesuai KAN U-01)</w:t>
+            </w:r>
+          </w:p>
+        </w:tc>
+        <w:tc>
+          <w:tcPr>
+            <w:tcW w:w="3500" w:type="dxa"/>
+            <w:shd w:val="clear" w:color="auto" w:fill="FFFFFF"/>
+            <w:tcMar>
+              <w:top w:w="100" w:type="dxa"/>
+              <w:bottom w:w="100" w:type="dxa"/>
+              <w:left w:w="140" w:type="dxa"/>
+              <w:right w:w="140" w:type="dxa"/>
+            </w:tcMar>
+          </w:tcPr>
+          <w:p>
+            <w:pPr/>
+            <w:r>
+              <w:rPr>
+                <w:rFonts w:ascii="Arial" w:hAnsi="Arial"/>
+                <w:sz w:val="19"/>
+              </w:rPr>
+              <w:t>Evaluasi tahun pertama kepatuhan standar ISO/IEC 17025. Sesuai klausul KAN U-01 &amp; ISO/IEC 17011, asesmen S1 wajib terlaksana paling lambat 24 bulan sejak tanggal sertifikat. Melewati Bulan ke-24 tanpa realisasi, status LPK otomatis beralih menjadi DIBEKUKAN (SUSPENDED).</w:t>
             </w:r>
           </w:p>
         </w:tc>
@@ -4186,24 +4191,21 @@
         <w:tc>
           <w:tcPr>
             <w:tcW w:w="1400" w:type="dxa"/>
-            <w:shd w:val="clear" w:color="auto" w:fill="F8FAFC"/>
-            <w:tcMar>
-              <w:top w:w="100" w:type="dxa"/>
-              <w:bottom w:w="100" w:type="dxa"/>
-              <w:left w:w="140" w:type="dxa"/>
-              <w:right w:w="140" w:type="dxa"/>
-            </w:tcMar>
-          </w:tcPr>
-          <w:p>
-            <w:pPr>
-              <w:jc w:val="center"/>
-              <w:spacing w:before="0" w:after="0" w:line="240" w:lineRule="auto"/>
-            </w:pPr>
-            <w:r>
-              <w:rPr>
-                <w:rFonts w:ascii="Calibri" w:hAnsi="Calibri"/>
-                <w:color w:val="000000"/>
-                <w:sz w:val="18"/>
+            <w:shd w:val="clear" w:color="auto" w:fill="FFFFFF"/>
+            <w:tcMar>
+              <w:top w:w="100" w:type="dxa"/>
+              <w:bottom w:w="100" w:type="dxa"/>
+              <w:left w:w="140" w:type="dxa"/>
+              <w:right w:w="140" w:type="dxa"/>
+            </w:tcMar>
+          </w:tcPr>
+          <w:p>
+            <w:pPr/>
+            <w:r>
+              <w:rPr>
+                <w:b/>
+                <w:rFonts w:ascii="Arial" w:hAnsi="Arial"/>
+                <w:sz w:val="19"/>
               </w:rPr>
               <w:t>Surveilen 2 (S2)</w:t>
             </w:r>
@@ -4211,133 +4213,141 @@
         </w:tc>
         <w:tc>
           <w:tcPr>
+            <w:tcW w:w="1800" w:type="dxa"/>
+            <w:shd w:val="clear" w:color="auto" w:fill="FFFFFF"/>
+            <w:tcMar>
+              <w:top w:w="100" w:type="dxa"/>
+              <w:bottom w:w="100" w:type="dxa"/>
+              <w:left w:w="140" w:type="dxa"/>
+              <w:right w:w="140" w:type="dxa"/>
+            </w:tcMar>
+          </w:tcPr>
+          <w:p>
+            <w:pPr/>
+            <w:r>
+              <w:rPr>
+                <w:rFonts w:ascii="Arial" w:hAnsi="Arial"/>
+                <w:sz w:val="19"/>
+              </w:rPr>
+              <w:t>Tanggal Penetapan Sertifikat (Tahun ke-3 Siklus Akreditasi)</w:t>
+            </w:r>
+          </w:p>
+        </w:tc>
+        <w:tc>
+          <w:tcPr>
+            <w:tcW w:w="1500" w:type="dxa"/>
+            <w:shd w:val="clear" w:color="auto" w:fill="FFFFFF"/>
+            <w:tcMar>
+              <w:top w:w="100" w:type="dxa"/>
+              <w:bottom w:w="100" w:type="dxa"/>
+              <w:left w:w="140" w:type="dxa"/>
+              <w:right w:w="140" w:type="dxa"/>
+            </w:tcMar>
+          </w:tcPr>
+          <w:p>
+            <w:pPr/>
+            <w:r>
+              <w:rPr>
+                <w:rFonts w:ascii="Arial" w:hAnsi="Arial"/>
+                <w:sz w:val="19"/>
+              </w:rPr>
+              <w:t>Bulan ke-34 s/d 35</w:t>
+            </w:r>
+          </w:p>
+          <w:p>
+            <w:pPr/>
+            <w:r>
+              <w:rPr>
+                <w:rFonts w:ascii="Arial" w:hAnsi="Arial"/>
+                <w:sz w:val="19"/>
+              </w:rPr>
+              <w:t>(H-2 bln pengingat awal &amp; email aktif)</w:t>
+            </w:r>
+          </w:p>
+        </w:tc>
+        <w:tc>
+          <w:tcPr>
             <w:tcW w:w="1600" w:type="dxa"/>
-            <w:shd w:val="clear" w:color="auto" w:fill="F8FAFC"/>
-            <w:tcMar>
-              <w:top w:w="100" w:type="dxa"/>
-              <w:bottom w:w="100" w:type="dxa"/>
-              <w:left w:w="140" w:type="dxa"/>
-              <w:right w:w="140" w:type="dxa"/>
-            </w:tcMar>
-          </w:tcPr>
-          <w:p>
-            <w:pPr>
-              <w:jc w:val="left"/>
-              <w:spacing w:before="0" w:after="0" w:line="240" w:lineRule="auto"/>
-            </w:pPr>
-            <w:r>
-              <w:rPr>
-                <w:rFonts w:ascii="Calibri" w:hAnsi="Calibri"/>
-                <w:color w:val="000000"/>
-                <w:sz w:val="18"/>
-              </w:rPr>
-              <w:t>Tanggal Penetapan Sertifikat (certificate_date)</w:t>
-            </w:r>
-          </w:p>
-        </w:tc>
-        <w:tc>
-          <w:tcPr>
-            <w:tcW w:w="1500" w:type="dxa"/>
-            <w:shd w:val="clear" w:color="auto" w:fill="F8FAFC"/>
-            <w:tcMar>
-              <w:top w:w="100" w:type="dxa"/>
-              <w:bottom w:w="100" w:type="dxa"/>
-              <w:left w:w="140" w:type="dxa"/>
-              <w:right w:w="140" w:type="dxa"/>
-            </w:tcMar>
-          </w:tcPr>
-          <w:p>
-            <w:pPr>
-              <w:jc w:val="left"/>
-              <w:spacing w:before="0" w:after="0" w:line="240" w:lineRule="auto"/>
-            </w:pPr>
-            <w:r>
-              <w:rPr>
-                <w:rFonts w:ascii="Calibri" w:hAnsi="Calibri"/>
-                <w:color w:val="000000"/>
-                <w:sz w:val="18"/>
-              </w:rPr>
-              <w:t>Bulan ke-35
-(H-1 Bulan)</w:t>
-            </w:r>
-          </w:p>
-        </w:tc>
-        <w:tc>
-          <w:tcPr>
-            <w:tcW w:w="1500" w:type="dxa"/>
-            <w:shd w:val="clear" w:color="auto" w:fill="F8FAFC"/>
-            <w:tcMar>
-              <w:top w:w="100" w:type="dxa"/>
-              <w:bottom w:w="100" w:type="dxa"/>
-              <w:left w:w="140" w:type="dxa"/>
-              <w:right w:w="140" w:type="dxa"/>
-            </w:tcMar>
-          </w:tcPr>
-          <w:p>
-            <w:pPr>
-              <w:jc w:val="center"/>
-              <w:spacing w:before="0" w:after="0" w:line="240" w:lineRule="auto"/>
-            </w:pPr>
-            <w:r>
-              <w:rPr>
-                <w:rFonts w:ascii="Calibri" w:hAnsi="Calibri"/>
-                <w:color w:val="000000"/>
-                <w:sz w:val="18"/>
+            <w:shd w:val="clear" w:color="auto" w:fill="FFFFFF"/>
+            <w:tcMar>
+              <w:top w:w="100" w:type="dxa"/>
+              <w:bottom w:w="100" w:type="dxa"/>
+              <w:left w:w="140" w:type="dxa"/>
+              <w:right w:w="140" w:type="dxa"/>
+            </w:tcMar>
+          </w:tcPr>
+          <w:p>
+            <w:pPr/>
+            <w:r>
+              <w:rPr>
+                <w:rFonts w:ascii="Arial" w:hAnsi="Arial"/>
+                <w:sz w:val="19"/>
               </w:rPr>
               <w:t>Bulan ke-36 s/d Bulan ke-39</w:t>
             </w:r>
           </w:p>
-        </w:tc>
-        <w:tc>
-          <w:tcPr>
-            <w:tcW w:w="1500" w:type="dxa"/>
-            <w:shd w:val="clear" w:color="auto" w:fill="F8FAFC"/>
-            <w:tcMar>
-              <w:top w:w="100" w:type="dxa"/>
-              <w:bottom w:w="100" w:type="dxa"/>
-              <w:left w:w="140" w:type="dxa"/>
-              <w:right w:w="140" w:type="dxa"/>
-            </w:tcMar>
-          </w:tcPr>
-          <w:p>
-            <w:pPr>
-              <w:jc w:val="left"/>
-              <w:spacing w:before="0" w:after="0" w:line="240" w:lineRule="auto"/>
-            </w:pPr>
-            <w:r>
-              <w:rPr>
-                <w:rFonts w:ascii="Calibri" w:hAnsi="Calibri"/>
-                <w:color w:val="000000"/>
-                <w:sz w:val="18"/>
-              </w:rPr>
-              <w:t>Maksimal Bulan ke-40
-(Bln 36 + 4 Bulan)</w:t>
-            </w:r>
-          </w:p>
-        </w:tc>
-        <w:tc>
-          <w:tcPr>
-            <w:tcW w:w="1500" w:type="dxa"/>
-            <w:shd w:val="clear" w:color="auto" w:fill="F8FAFC"/>
-            <w:tcMar>
-              <w:top w:w="100" w:type="dxa"/>
-              <w:bottom w:w="100" w:type="dxa"/>
-              <w:left w:w="140" w:type="dxa"/>
-              <w:right w:w="140" w:type="dxa"/>
-            </w:tcMar>
-          </w:tcPr>
-          <w:p>
-            <w:pPr>
-              <w:jc w:val="left"/>
-              <w:spacing w:before="0" w:after="0" w:line="240" w:lineRule="auto"/>
-            </w:pPr>
-            <w:r>
-              <w:rPr>
-                <w:rFonts w:ascii="Calibri" w:hAnsi="Calibri"/>
-                <w:color w:val="000000"/>
-                <w:sz w:val="18"/>
-              </w:rPr>
-              <w:t>Evaluasi tahun ketiga sistem manajemen mutu laboratorium. Peringatan otomatis dinonaktifkan setelah asesmen S2 dijadwalkan.</w:t>
+          <w:p>
+            <w:pPr/>
+            <w:r>
+              <w:rPr>
+                <w:rFonts w:ascii="Arial" w:hAnsi="Arial"/>
+                <w:sz w:val="19"/>
+              </w:rPr>
+              <w:t>(Target Kunjungan Normal S2)</w:t>
+            </w:r>
+          </w:p>
+        </w:tc>
+        <w:tc>
+          <w:tcPr>
+            <w:tcW w:w="1600" w:type="dxa"/>
+            <w:shd w:val="clear" w:color="auto" w:fill="FFFFFF"/>
+            <w:tcMar>
+              <w:top w:w="100" w:type="dxa"/>
+              <w:bottom w:w="100" w:type="dxa"/>
+              <w:left w:w="140" w:type="dxa"/>
+              <w:right w:w="140" w:type="dxa"/>
+            </w:tcMar>
+          </w:tcPr>
+          <w:p>
+            <w:pPr/>
+            <w:r>
+              <w:rPr>
+                <w:rFonts w:ascii="Arial" w:hAnsi="Arial"/>
+                <w:sz w:val="19"/>
+              </w:rPr>
+              <w:t>Maksimal Bulan ke-48</w:t>
+            </w:r>
+          </w:p>
+          <w:p>
+            <w:pPr/>
+            <w:r>
+              <w:rPr>
+                <w:rFonts w:ascii="Arial" w:hAnsi="Arial"/>
+                <w:sz w:val="19"/>
+              </w:rPr>
+              <w:t>(Akhir Tahun ke-4 Siklus)</w:t>
+            </w:r>
+          </w:p>
+        </w:tc>
+        <w:tc>
+          <w:tcPr>
+            <w:tcW w:w="3500" w:type="dxa"/>
+            <w:shd w:val="clear" w:color="auto" w:fill="FFFFFF"/>
+            <w:tcMar>
+              <w:top w:w="100" w:type="dxa"/>
+              <w:bottom w:w="100" w:type="dxa"/>
+              <w:left w:w="140" w:type="dxa"/>
+              <w:right w:w="140" w:type="dxa"/>
+            </w:tcMar>
+          </w:tcPr>
+          <w:p>
+            <w:pPr/>
+            <w:r>
+              <w:rPr>
+                <w:rFonts w:ascii="Arial" w:hAnsi="Arial"/>
+                <w:sz w:val="19"/>
+              </w:rPr>
+              <w:t>Evaluasi tahun ketiga konsistensi kompetensi teknis dan sistem manajemen mutu laboratorium. Peringatan otomatis terpicu di kalender &amp; email PIC. Melewati batas toleransi tanpa penjadwalan, status LPK beralih menjadi DIBEKUKAN (SUSPENDED).</w:t>
             </w:r>
           </w:p>
         </w:tc>
@@ -4358,17 +4368,68 @@
             </w:tcMar>
           </w:tcPr>
           <w:p>
-            <w:pPr>
-              <w:jc w:val="center"/>
-              <w:spacing w:before="0" w:after="0" w:line="240" w:lineRule="auto"/>
-            </w:pPr>
-            <w:r>
-              <w:rPr>
-                <w:rFonts w:ascii="Calibri" w:hAnsi="Calibri"/>
-                <w:color w:val="000000"/>
-                <w:sz w:val="18"/>
-              </w:rPr>
-              <w:t>Re-Akreditasi (RA)</w:t>
+            <w:pPr/>
+            <w:r>
+              <w:rPr>
+                <w:b/>
+                <w:rFonts w:ascii="Arial" w:hAnsi="Arial"/>
+                <w:sz w:val="19"/>
+              </w:rPr>
+              <w:t>Re-Akreditasi (RA) - Pengajuan &amp; Verifikasi Dokumen</w:t>
+            </w:r>
+          </w:p>
+        </w:tc>
+        <w:tc>
+          <w:tcPr>
+            <w:tcW w:w="1800" w:type="dxa"/>
+            <w:shd w:val="clear" w:color="auto" w:fill="FFFFFF"/>
+            <w:tcMar>
+              <w:top w:w="100" w:type="dxa"/>
+              <w:bottom w:w="100" w:type="dxa"/>
+              <w:left w:w="140" w:type="dxa"/>
+              <w:right w:w="140" w:type="dxa"/>
+            </w:tcMar>
+          </w:tcPr>
+          <w:p>
+            <w:pPr/>
+            <w:r>
+              <w:rPr>
+                <w:rFonts w:ascii="Arial" w:hAnsi="Arial"/>
+                <w:sz w:val="19"/>
+              </w:rPr>
+              <w:t>H-12 Bulan Kedaluwarsa Sertifikat (Bulan ke-48)</w:t>
+            </w:r>
+          </w:p>
+        </w:tc>
+        <w:tc>
+          <w:tcPr>
+            <w:tcW w:w="1500" w:type="dxa"/>
+            <w:shd w:val="clear" w:color="auto" w:fill="FFFFFF"/>
+            <w:tcMar>
+              <w:top w:w="100" w:type="dxa"/>
+              <w:bottom w:w="100" w:type="dxa"/>
+              <w:left w:w="140" w:type="dxa"/>
+              <w:right w:w="140" w:type="dxa"/>
+            </w:tcMar>
+          </w:tcPr>
+          <w:p>
+            <w:pPr/>
+            <w:r>
+              <w:rPr>
+                <w:rFonts w:ascii="Arial" w:hAnsi="Arial"/>
+                <w:sz w:val="19"/>
+              </w:rPr>
+              <w:t>Bulan ke-48</w:t>
+            </w:r>
+          </w:p>
+          <w:p>
+            <w:pPr/>
+            <w:r>
+              <w:rPr>
+                <w:rFonts w:ascii="Arial" w:hAnsi="Arial"/>
+                <w:sz w:val="19"/>
+              </w:rPr>
+              <w:t>(Mulai Unggah Berkas Permohonan RA)</w:t>
             </w:r>
           </w:p>
         </w:tc>
@@ -4384,123 +4445,77 @@
             </w:tcMar>
           </w:tcPr>
           <w:p>
-            <w:pPr>
-              <w:jc w:val="left"/>
-              <w:spacing w:before="0" w:after="0" w:line="240" w:lineRule="auto"/>
-            </w:pPr>
-            <w:r>
-              <w:rPr>
-                <w:rFonts w:ascii="Calibri" w:hAnsi="Calibri"/>
-                <w:color w:val="000000"/>
-                <w:sz w:val="18"/>
-              </w:rPr>
-              <w:t>Tanggal Habis Berlaku / H-12 Bulan Kedaluwarsa</w:t>
-            </w:r>
-          </w:p>
-        </w:tc>
-        <w:tc>
-          <w:tcPr>
-            <w:tcW w:w="1500" w:type="dxa"/>
-            <w:shd w:val="clear" w:color="auto" w:fill="FFFFFF"/>
-            <w:tcMar>
-              <w:top w:w="100" w:type="dxa"/>
-              <w:bottom w:w="100" w:type="dxa"/>
-              <w:left w:w="140" w:type="dxa"/>
-              <w:right w:w="140" w:type="dxa"/>
-            </w:tcMar>
-          </w:tcPr>
-          <w:p>
-            <w:pPr>
-              <w:jc w:val="left"/>
-              <w:spacing w:before="0" w:after="0" w:line="240" w:lineRule="auto"/>
-            </w:pPr>
-            <w:r>
-              <w:rPr>
-                <w:rFonts w:ascii="Calibri" w:hAnsi="Calibri"/>
-                <w:color w:val="000000"/>
-                <w:sz w:val="18"/>
-              </w:rPr>
-              <w:t>Bulan ke-48
-(H-12 Bulan Habis)</w:t>
-            </w:r>
-          </w:p>
-        </w:tc>
-        <w:tc>
-          <w:tcPr>
-            <w:tcW w:w="1500" w:type="dxa"/>
-            <w:shd w:val="clear" w:color="auto" w:fill="FFFFFF"/>
-            <w:tcMar>
-              <w:top w:w="100" w:type="dxa"/>
-              <w:bottom w:w="100" w:type="dxa"/>
-              <w:left w:w="140" w:type="dxa"/>
-              <w:right w:w="140" w:type="dxa"/>
-            </w:tcMar>
-          </w:tcPr>
-          <w:p>
-            <w:pPr>
-              <w:jc w:val="center"/>
-              <w:spacing w:before="0" w:after="0" w:line="240" w:lineRule="auto"/>
-            </w:pPr>
-            <w:r>
-              <w:rPr>
-                <w:rFonts w:ascii="Calibri" w:hAnsi="Calibri"/>
-                <w:color w:val="000000"/>
-                <w:sz w:val="18"/>
-              </w:rPr>
-              <w:t>Bulan ke-48 s/d Bulan ke-54</w:t>
-            </w:r>
-          </w:p>
-        </w:tc>
-        <w:tc>
-          <w:tcPr>
-            <w:tcW w:w="1500" w:type="dxa"/>
-            <w:shd w:val="clear" w:color="auto" w:fill="FFFFFF"/>
-            <w:tcMar>
-              <w:top w:w="100" w:type="dxa"/>
-              <w:bottom w:w="100" w:type="dxa"/>
-              <w:left w:w="140" w:type="dxa"/>
-              <w:right w:w="140" w:type="dxa"/>
-            </w:tcMar>
-          </w:tcPr>
-          <w:p>
-            <w:pPr>
-              <w:jc w:val="left"/>
-              <w:spacing w:before="0" w:after="0" w:line="240" w:lineRule="auto"/>
-            </w:pPr>
-            <w:r>
-              <w:rPr>
-                <w:rFonts w:ascii="Calibri" w:hAnsi="Calibri"/>
-                <w:color w:val="000000"/>
-                <w:sz w:val="18"/>
-              </w:rPr>
-              <w:t>Bulan ke-60
-(expired_at)</w:t>
-            </w:r>
-          </w:p>
-        </w:tc>
-        <w:tc>
-          <w:tcPr>
-            <w:tcW w:w="1500" w:type="dxa"/>
-            <w:shd w:val="clear" w:color="auto" w:fill="FFFFFF"/>
-            <w:tcMar>
-              <w:top w:w="100" w:type="dxa"/>
-              <w:bottom w:w="100" w:type="dxa"/>
-              <w:left w:w="140" w:type="dxa"/>
-              <w:right w:w="140" w:type="dxa"/>
-            </w:tcMar>
-          </w:tcPr>
-          <w:p>
-            <w:pPr>
-              <w:jc w:val="left"/>
-              <w:spacing w:before="0" w:after="0" w:line="240" w:lineRule="auto"/>
-            </w:pPr>
-            <w:r>
-              <w:rPr>
-                <w:rFonts w:ascii="Calibri" w:hAnsi="Calibri"/>
-                <w:color w:val="000000"/>
-                <w:sz w:val="18"/>
-              </w:rPr>
-              <w:t>Unggah permohonan mulai Bulan ke-48 agar asesmen tuntas di Bulan ke-54 dan SK baru terbit sebelum sertifikat kedaluwarsa.</w:t>
+            <w:pPr/>
+            <w:r>
+              <w:rPr>
+                <w:rFonts w:ascii="Arial" w:hAnsi="Arial"/>
+                <w:sz w:val="19"/>
+              </w:rPr>
+              <w:t>Bulan ke-48 s/d Bulan ke-51</w:t>
+            </w:r>
+          </w:p>
+          <w:p>
+            <w:pPr/>
+            <w:r>
+              <w:rPr>
+                <w:rFonts w:ascii="Arial" w:hAnsi="Arial"/>
+                <w:sz w:val="19"/>
+              </w:rPr>
+              <w:t>(Pemeriksaan Kecukupan Dokumen)</w:t>
+            </w:r>
+          </w:p>
+        </w:tc>
+        <w:tc>
+          <w:tcPr>
+            <w:tcW w:w="1600" w:type="dxa"/>
+            <w:shd w:val="clear" w:color="auto" w:fill="FFFFFF"/>
+            <w:tcMar>
+              <w:top w:w="100" w:type="dxa"/>
+              <w:bottom w:w="100" w:type="dxa"/>
+              <w:left w:w="140" w:type="dxa"/>
+              <w:right w:w="140" w:type="dxa"/>
+            </w:tcMar>
+          </w:tcPr>
+          <w:p>
+            <w:pPr/>
+            <w:r>
+              <w:rPr>
+                <w:rFonts w:ascii="Arial" w:hAnsi="Arial"/>
+                <w:sz w:val="19"/>
+              </w:rPr>
+              <w:t>Bulan ke-51</w:t>
+            </w:r>
+          </w:p>
+          <w:p>
+            <w:pPr/>
+            <w:r>
+              <w:rPr>
+                <w:rFonts w:ascii="Arial" w:hAnsi="Arial"/>
+                <w:sz w:val="19"/>
+              </w:rPr>
+              <w:t>(H-9 Bulan Kedaluwarsa)</w:t>
+            </w:r>
+          </w:p>
+        </w:tc>
+        <w:tc>
+          <w:tcPr>
+            <w:tcW w:w="3500" w:type="dxa"/>
+            <w:shd w:val="clear" w:color="auto" w:fill="FFFFFF"/>
+            <w:tcMar>
+              <w:top w:w="100" w:type="dxa"/>
+              <w:bottom w:w="100" w:type="dxa"/>
+              <w:left w:w="140" w:type="dxa"/>
+              <w:right w:w="140" w:type="dxa"/>
+            </w:tcMar>
+          </w:tcPr>
+          <w:p>
+            <w:pPr/>
+            <w:r>
+              <w:rPr>
+                <w:rFonts w:ascii="Arial" w:hAnsi="Arial"/>
+                <w:sz w:val="19"/>
+              </w:rPr>
+              <w:t>Seluruh berkas permohonan akreditasi ulang, instrumen asesmen, rekaman audit internal, kaji ulang manajemen, dan uji profisiensi wajib dinyatakan LENGKAP oleh sekretariat KAN paling lambat Bulan ke-51 agar tim asesor dapat segera ditetapkan.</w:t>
             </w:r>
           </w:p>
         </w:tc>
@@ -4512,158 +4527,499 @@
         <w:tc>
           <w:tcPr>
             <w:tcW w:w="1400" w:type="dxa"/>
-            <w:shd w:val="clear" w:color="auto" w:fill="F8FAFC"/>
-            <w:tcMar>
-              <w:top w:w="100" w:type="dxa"/>
-              <w:bottom w:w="100" w:type="dxa"/>
-              <w:left w:w="140" w:type="dxa"/>
-              <w:right w:w="140" w:type="dxa"/>
-            </w:tcMar>
-          </w:tcPr>
-          <w:p>
-            <w:pPr>
-              <w:jc w:val="center"/>
-              <w:spacing w:before="0" w:after="0" w:line="240" w:lineRule="auto"/>
-            </w:pPr>
-            <w:r>
-              <w:rPr>
-                <w:rFonts w:ascii="Calibri" w:hAnsi="Calibri"/>
-                <w:color w:val="000000"/>
-                <w:sz w:val="18"/>
-              </w:rPr>
-              <w:t>Kedaluwarsa Sertifikat</w:t>
+            <w:shd w:val="clear" w:color="auto" w:fill="FFFFFF"/>
+            <w:tcMar>
+              <w:top w:w="100" w:type="dxa"/>
+              <w:bottom w:w="100" w:type="dxa"/>
+              <w:left w:w="140" w:type="dxa"/>
+              <w:right w:w="140" w:type="dxa"/>
+            </w:tcMar>
+          </w:tcPr>
+          <w:p>
+            <w:pPr/>
+            <w:r>
+              <w:rPr>
+                <w:b/>
+                <w:rFonts w:ascii="Arial" w:hAnsi="Arial"/>
+                <w:sz w:val="19"/>
+              </w:rPr>
+              <w:t>Re-Akreditasi (RA) - Pelaksanaan Asesmen Lapangan</w:t>
+            </w:r>
+          </w:p>
+        </w:tc>
+        <w:tc>
+          <w:tcPr>
+            <w:tcW w:w="1800" w:type="dxa"/>
+            <w:shd w:val="clear" w:color="auto" w:fill="FFFFFF"/>
+            <w:tcMar>
+              <w:top w:w="100" w:type="dxa"/>
+              <w:bottom w:w="100" w:type="dxa"/>
+              <w:left w:w="140" w:type="dxa"/>
+              <w:right w:w="140" w:type="dxa"/>
+            </w:tcMar>
+          </w:tcPr>
+          <w:p>
+            <w:pPr/>
+            <w:r>
+              <w:rPr>
+                <w:rFonts w:ascii="Arial" w:hAnsi="Arial"/>
+                <w:sz w:val="19"/>
+              </w:rPr>
+              <w:t>H-6 Bulan Kedaluwarsa Sertifikat (Bulan ke-54)</w:t>
+            </w:r>
+          </w:p>
+        </w:tc>
+        <w:tc>
+          <w:tcPr>
+            <w:tcW w:w="1500" w:type="dxa"/>
+            <w:shd w:val="clear" w:color="auto" w:fill="FFFFFF"/>
+            <w:tcMar>
+              <w:top w:w="100" w:type="dxa"/>
+              <w:bottom w:w="100" w:type="dxa"/>
+              <w:left w:w="140" w:type="dxa"/>
+              <w:right w:w="140" w:type="dxa"/>
+            </w:tcMar>
+          </w:tcPr>
+          <w:p>
+            <w:pPr/>
+            <w:r>
+              <w:rPr>
+                <w:rFonts w:ascii="Arial" w:hAnsi="Arial"/>
+                <w:sz w:val="19"/>
+              </w:rPr>
+              <w:t>Bulan ke-51 s/d Bulan ke-53</w:t>
+            </w:r>
+          </w:p>
+          <w:p>
+            <w:pPr/>
+            <w:r>
+              <w:rPr>
+                <w:rFonts w:ascii="Arial" w:hAnsi="Arial"/>
+                <w:sz w:val="19"/>
+              </w:rPr>
+              <w:t>(Koordinasi Jadwal Lapangan)</w:t>
             </w:r>
           </w:p>
         </w:tc>
         <w:tc>
           <w:tcPr>
             <w:tcW w:w="1600" w:type="dxa"/>
-            <w:shd w:val="clear" w:color="auto" w:fill="F8FAFC"/>
-            <w:tcMar>
-              <w:top w:w="100" w:type="dxa"/>
-              <w:bottom w:w="100" w:type="dxa"/>
-              <w:left w:w="140" w:type="dxa"/>
-              <w:right w:w="140" w:type="dxa"/>
-            </w:tcMar>
-          </w:tcPr>
-          <w:p>
-            <w:pPr>
-              <w:jc w:val="left"/>
-              <w:spacing w:before="0" w:after="0" w:line="240" w:lineRule="auto"/>
-            </w:pPr>
-            <w:r>
-              <w:rPr>
-                <w:rFonts w:ascii="Calibri" w:hAnsi="Calibri"/>
-                <w:color w:val="000000"/>
-                <w:sz w:val="18"/>
-              </w:rPr>
-              <w:t>Tanggal Habis Berlaku (expired_at)</w:t>
+            <w:shd w:val="clear" w:color="auto" w:fill="FFFFFF"/>
+            <w:tcMar>
+              <w:top w:w="100" w:type="dxa"/>
+              <w:bottom w:w="100" w:type="dxa"/>
+              <w:left w:w="140" w:type="dxa"/>
+              <w:right w:w="140" w:type="dxa"/>
+            </w:tcMar>
+          </w:tcPr>
+          <w:p>
+            <w:pPr/>
+            <w:r>
+              <w:rPr>
+                <w:rFonts w:ascii="Arial" w:hAnsi="Arial"/>
+                <w:sz w:val="19"/>
+              </w:rPr>
+              <w:t>Bulan ke-51 s/d Bulan ke-54</w:t>
+            </w:r>
+          </w:p>
+          <w:p>
+            <w:pPr/>
+            <w:r>
+              <w:rPr>
+                <w:rFonts w:ascii="Arial" w:hAnsi="Arial"/>
+                <w:sz w:val="19"/>
+              </w:rPr>
+              <w:t>(Batas Akhir Kunjungan Lapangan)</w:t>
+            </w:r>
+          </w:p>
+        </w:tc>
+        <w:tc>
+          <w:tcPr>
+            <w:tcW w:w="1600" w:type="dxa"/>
+            <w:shd w:val="clear" w:color="auto" w:fill="FFFFFF"/>
+            <w:tcMar>
+              <w:top w:w="100" w:type="dxa"/>
+              <w:bottom w:w="100" w:type="dxa"/>
+              <w:left w:w="140" w:type="dxa"/>
+              <w:right w:w="140" w:type="dxa"/>
+            </w:tcMar>
+          </w:tcPr>
+          <w:p>
+            <w:pPr/>
+            <w:r>
+              <w:rPr>
+                <w:rFonts w:ascii="Arial" w:hAnsi="Arial"/>
+                <w:sz w:val="19"/>
+              </w:rPr>
+              <w:t>Maksimal Bulan ke-54</w:t>
+            </w:r>
+          </w:p>
+          <w:p>
+            <w:pPr/>
+            <w:r>
+              <w:rPr>
+                <w:rFonts w:ascii="Arial" w:hAnsi="Arial"/>
+                <w:sz w:val="19"/>
+              </w:rPr>
+              <w:t>(Batas Aman Kunjungan On-site)</w:t>
+            </w:r>
+          </w:p>
+        </w:tc>
+        <w:tc>
+          <w:tcPr>
+            <w:tcW w:w="3500" w:type="dxa"/>
+            <w:shd w:val="clear" w:color="auto" w:fill="FFFFFF"/>
+            <w:tcMar>
+              <w:top w:w="100" w:type="dxa"/>
+              <w:bottom w:w="100" w:type="dxa"/>
+              <w:left w:w="140" w:type="dxa"/>
+              <w:right w:w="140" w:type="dxa"/>
+            </w:tcMar>
+          </w:tcPr>
+          <w:p>
+            <w:pPr/>
+            <w:r>
+              <w:rPr>
+                <w:rFonts w:ascii="Arial" w:hAnsi="Arial"/>
+                <w:sz w:val="19"/>
+              </w:rPr>
+              <w:t>Pelaksanaan asesmen on-site re-akreditasi wajib tuntas paling lambat Bulan ke-54 agar menyisakan alokasi waktu aman 6 bulan (buffer Bulan 55 s/d 60) untuk seluruh rangkaian proses pasca-asesmen sebelum sertifikat lama habis masa berlakunya.</w:t>
+            </w:r>
+          </w:p>
+        </w:tc>
+      </w:tr>
+      <w:tr>
+        <w:trPr>
+          <w:cantSplit/>
+        </w:trPr>
+        <w:tc>
+          <w:tcPr>
+            <w:tcW w:w="1400" w:type="dxa"/>
+            <w:shd w:val="clear" w:color="auto" w:fill="FFFFFF"/>
+            <w:tcMar>
+              <w:top w:w="100" w:type="dxa"/>
+              <w:bottom w:w="100" w:type="dxa"/>
+              <w:left w:w="140" w:type="dxa"/>
+              <w:right w:w="140" w:type="dxa"/>
+            </w:tcMar>
+          </w:tcPr>
+          <w:p>
+            <w:pPr/>
+            <w:r>
+              <w:rPr>
+                <w:b/>
+                <w:rFonts w:ascii="Arial" w:hAnsi="Arial"/>
+                <w:sz w:val="19"/>
+              </w:rPr>
+              <w:t>Rentang Pasca-Asesmen Lapangan RA (Buffer 6 Bulan)</w:t>
+            </w:r>
+          </w:p>
+        </w:tc>
+        <w:tc>
+          <w:tcPr>
+            <w:tcW w:w="1800" w:type="dxa"/>
+            <w:shd w:val="clear" w:color="auto" w:fill="FFFFFF"/>
+            <w:tcMar>
+              <w:top w:w="100" w:type="dxa"/>
+              <w:bottom w:w="100" w:type="dxa"/>
+              <w:left w:w="140" w:type="dxa"/>
+              <w:right w:w="140" w:type="dxa"/>
+            </w:tcMar>
+          </w:tcPr>
+          <w:p>
+            <w:pPr/>
+            <w:r>
+              <w:rPr>
+                <w:rFonts w:ascii="Arial" w:hAnsi="Arial"/>
+                <w:sz w:val="19"/>
+              </w:rPr>
+              <w:t>Sisa Masa Berlaku Sertifikat (Bulan ke-55 s/d Bulan ke-60)</w:t>
             </w:r>
           </w:p>
         </w:tc>
         <w:tc>
           <w:tcPr>
             <w:tcW w:w="1500" w:type="dxa"/>
-            <w:shd w:val="clear" w:color="auto" w:fill="F8FAFC"/>
-            <w:tcMar>
-              <w:top w:w="100" w:type="dxa"/>
-              <w:bottom w:w="100" w:type="dxa"/>
-              <w:left w:w="140" w:type="dxa"/>
-              <w:right w:w="140" w:type="dxa"/>
-            </w:tcMar>
-          </w:tcPr>
-          <w:p>
-            <w:pPr>
-              <w:jc w:val="left"/>
-              <w:spacing w:before="0" w:after="0" w:line="240" w:lineRule="auto"/>
-            </w:pPr>
-            <w:r>
-              <w:rPr>
-                <w:rFonts w:ascii="Calibri" w:hAnsi="Calibri"/>
-                <w:color w:val="000000"/>
-                <w:sz w:val="18"/>
-              </w:rPr>
-              <w:t>Bulan ke-59
-(H-1 Bulan Habis)</w:t>
+            <w:shd w:val="clear" w:color="auto" w:fill="FFFFFF"/>
+            <w:tcMar>
+              <w:top w:w="100" w:type="dxa"/>
+              <w:bottom w:w="100" w:type="dxa"/>
+              <w:left w:w="140" w:type="dxa"/>
+              <w:right w:w="140" w:type="dxa"/>
+            </w:tcMar>
+          </w:tcPr>
+          <w:p>
+            <w:pPr/>
+            <w:r>
+              <w:rPr>
+                <w:rFonts w:ascii="Arial" w:hAnsi="Arial"/>
+                <w:sz w:val="19"/>
+              </w:rPr>
+              <w:t>Monitoring Mingguan</w:t>
+            </w:r>
+          </w:p>
+          <w:p>
+            <w:pPr/>
+            <w:r>
+              <w:rPr>
+                <w:rFonts w:ascii="Arial" w:hAnsi="Arial"/>
+                <w:sz w:val="19"/>
+              </w:rPr>
+              <w:t>(Penyelesaian Temuan &amp; Sidang EHA)</w:t>
+            </w:r>
+          </w:p>
+        </w:tc>
+        <w:tc>
+          <w:tcPr>
+            <w:tcW w:w="1600" w:type="dxa"/>
+            <w:shd w:val="clear" w:color="auto" w:fill="FFFFFF"/>
+            <w:tcMar>
+              <w:top w:w="100" w:type="dxa"/>
+              <w:bottom w:w="100" w:type="dxa"/>
+              <w:left w:w="140" w:type="dxa"/>
+              <w:right w:w="140" w:type="dxa"/>
+            </w:tcMar>
+          </w:tcPr>
+          <w:p>
+            <w:pPr/>
+            <w:r>
+              <w:rPr>
+                <w:rFonts w:ascii="Arial" w:hAnsi="Arial"/>
+                <w:sz w:val="19"/>
+              </w:rPr>
+              <w:t>Bulan ke-55 s/d Bulan ke-60</w:t>
+            </w:r>
+          </w:p>
+          <w:p>
+            <w:pPr/>
+            <w:r>
+              <w:rPr>
+                <w:rFonts w:ascii="Arial" w:hAnsi="Arial"/>
+                <w:sz w:val="19"/>
+              </w:rPr>
+              <w:t>(Rangkaian 4 Tahapan Wajib)</w:t>
+            </w:r>
+          </w:p>
+        </w:tc>
+        <w:tc>
+          <w:tcPr>
+            <w:tcW w:w="1600" w:type="dxa"/>
+            <w:shd w:val="clear" w:color="auto" w:fill="FFFFFF"/>
+            <w:tcMar>
+              <w:top w:w="100" w:type="dxa"/>
+              <w:bottom w:w="100" w:type="dxa"/>
+              <w:left w:w="140" w:type="dxa"/>
+              <w:right w:w="140" w:type="dxa"/>
+            </w:tcMar>
+          </w:tcPr>
+          <w:p>
+            <w:pPr/>
+            <w:r>
+              <w:rPr>
+                <w:rFonts w:ascii="Arial" w:hAnsi="Arial"/>
+                <w:sz w:val="19"/>
+              </w:rPr>
+              <w:t>Bulan ke-60</w:t>
+            </w:r>
+          </w:p>
+          <w:p>
+            <w:pPr/>
+            <w:r>
+              <w:rPr>
+                <w:rFonts w:ascii="Arial" w:hAnsi="Arial"/>
+                <w:sz w:val="19"/>
+              </w:rPr>
+              <w:t>(expired_at)</w:t>
+            </w:r>
+          </w:p>
+        </w:tc>
+        <w:tc>
+          <w:tcPr>
+            <w:tcW w:w="3500" w:type="dxa"/>
+            <w:shd w:val="clear" w:color="auto" w:fill="FFFFFF"/>
+            <w:tcMar>
+              <w:top w:w="100" w:type="dxa"/>
+              <w:bottom w:w="100" w:type="dxa"/>
+              <w:left w:w="140" w:type="dxa"/>
+              <w:right w:w="140" w:type="dxa"/>
+            </w:tcMar>
+          </w:tcPr>
+          <w:p>
+            <w:pPr/>
+            <w:r>
+              <w:rPr>
+                <w:rFonts w:ascii="Arial" w:hAnsi="Arial"/>
+                <w:sz w:val="19"/>
+              </w:rPr>
+              <w:t>Proses berlanjut melalui 4 tahap wajib: (1) Tindakan Perbaikan (TP/VTP) SLA normal 2 bulan (maks 3 bulan dengan perpanjangan resmi), (2) Finalisasi Laporan Asesor &amp; Sidang Evaluasi Hasil Asesmen (EHA) Panitia Teknis KAN, (3) Rapat Pleno Dewan/Council KAN untuk penetapan keputusan perpanjangan akreditasi, dan (4) Penerbitan SK &amp; Sertifikat Baru sebelum Bulan ke-60 agar tidak terjadi kekosongan status akreditasi.</w:t>
+            </w:r>
+          </w:p>
+        </w:tc>
+      </w:tr>
+      <w:tr>
+        <w:trPr>
+          <w:cantSplit/>
+        </w:trPr>
+        <w:tc>
+          <w:tcPr>
+            <w:tcW w:w="1400" w:type="dxa"/>
+            <w:shd w:val="clear" w:color="auto" w:fill="FFFFFF"/>
+            <w:tcMar>
+              <w:top w:w="100" w:type="dxa"/>
+              <w:bottom w:w="100" w:type="dxa"/>
+              <w:left w:w="140" w:type="dxa"/>
+              <w:right w:w="140" w:type="dxa"/>
+            </w:tcMar>
+          </w:tcPr>
+          <w:p>
+            <w:pPr/>
+            <w:r>
+              <w:rPr>
+                <w:b/>
+                <w:rFonts w:ascii="Arial" w:hAnsi="Arial"/>
+                <w:sz w:val="19"/>
+              </w:rPr>
+              <w:t>Kedaluwarsa Sertifikat &amp; Masa Tenggang (Grace Period)</w:t>
+            </w:r>
+          </w:p>
+        </w:tc>
+        <w:tc>
+          <w:tcPr>
+            <w:tcW w:w="1800" w:type="dxa"/>
+            <w:shd w:val="clear" w:color="auto" w:fill="FFFFFF"/>
+            <w:tcMar>
+              <w:top w:w="100" w:type="dxa"/>
+              <w:bottom w:w="100" w:type="dxa"/>
+              <w:left w:w="140" w:type="dxa"/>
+              <w:right w:w="140" w:type="dxa"/>
+            </w:tcMar>
+          </w:tcPr>
+          <w:p>
+            <w:pPr/>
+            <w:r>
+              <w:rPr>
+                <w:rFonts w:ascii="Arial" w:hAnsi="Arial"/>
+                <w:sz w:val="19"/>
+              </w:rPr>
+              <w:t>Tanggal Habis Berlaku Sertifikat (expired_at / Bulan ke-60)</w:t>
             </w:r>
           </w:p>
         </w:tc>
         <w:tc>
           <w:tcPr>
             <w:tcW w:w="1500" w:type="dxa"/>
-            <w:shd w:val="clear" w:color="auto" w:fill="F8FAFC"/>
-            <w:tcMar>
-              <w:top w:w="100" w:type="dxa"/>
-              <w:bottom w:w="100" w:type="dxa"/>
-              <w:left w:w="140" w:type="dxa"/>
-              <w:right w:w="140" w:type="dxa"/>
-            </w:tcMar>
-          </w:tcPr>
-          <w:p>
-            <w:pPr>
-              <w:jc w:val="center"/>
-              <w:spacing w:before="0" w:after="0" w:line="240" w:lineRule="auto"/>
-            </w:pPr>
-            <w:r>
-              <w:rPr>
-                <w:rFonts w:ascii="Calibri" w:hAnsi="Calibri"/>
-                <w:color w:val="000000"/>
-                <w:sz w:val="18"/>
-              </w:rPr>
-              <w:t>Bulan ke-60
-(expired_at)</w:t>
-            </w:r>
-          </w:p>
-        </w:tc>
-        <w:tc>
-          <w:tcPr>
-            <w:tcW w:w="1500" w:type="dxa"/>
-            <w:shd w:val="clear" w:color="auto" w:fill="F8FAFC"/>
-            <w:tcMar>
-              <w:top w:w="100" w:type="dxa"/>
-              <w:bottom w:w="100" w:type="dxa"/>
-              <w:left w:w="140" w:type="dxa"/>
-              <w:right w:w="140" w:type="dxa"/>
-            </w:tcMar>
-          </w:tcPr>
-          <w:p>
-            <w:pPr>
-              <w:jc w:val="left"/>
-              <w:spacing w:before="0" w:after="0" w:line="240" w:lineRule="auto"/>
-            </w:pPr>
-            <w:r>
-              <w:rPr>
-                <w:rFonts w:ascii="Calibri" w:hAnsi="Calibri"/>
-                <w:color w:val="000000"/>
-                <w:sz w:val="18"/>
-              </w:rPr>
-              <w:t>Grace Period 1 Tahun (Pembekuan)</w:t>
-            </w:r>
-          </w:p>
-        </w:tc>
-        <w:tc>
-          <w:tcPr>
-            <w:tcW w:w="1500" w:type="dxa"/>
-            <w:shd w:val="clear" w:color="auto" w:fill="F8FAFC"/>
-            <w:tcMar>
-              <w:top w:w="100" w:type="dxa"/>
-              <w:bottom w:w="100" w:type="dxa"/>
-              <w:left w:w="140" w:type="dxa"/>
-              <w:right w:w="140" w:type="dxa"/>
-            </w:tcMar>
-          </w:tcPr>
-          <w:p>
-            <w:pPr>
-              <w:jc w:val="left"/>
-              <w:spacing w:before="0" w:after="0" w:line="240" w:lineRule="auto"/>
-            </w:pPr>
-            <w:r>
-              <w:rPr>
-                <w:rFonts w:ascii="Calibri" w:hAnsi="Calibri"/>
-                <w:color w:val="000000"/>
-                <w:sz w:val="18"/>
-              </w:rPr>
-              <w:t>Status LPK otomatis menjadi EXPIRED jika Re-Akreditasi tidak rampung sebelum tanggal habis berlaku sertifikat.</w:t>
+            <w:shd w:val="clear" w:color="auto" w:fill="FFFFFF"/>
+            <w:tcMar>
+              <w:top w:w="100" w:type="dxa"/>
+              <w:bottom w:w="100" w:type="dxa"/>
+              <w:left w:w="140" w:type="dxa"/>
+              <w:right w:w="140" w:type="dxa"/>
+            </w:tcMar>
+          </w:tcPr>
+          <w:p>
+            <w:pPr/>
+            <w:r>
+              <w:rPr>
+                <w:rFonts w:ascii="Arial" w:hAnsi="Arial"/>
+                <w:sz w:val="19"/>
+              </w:rPr>
+              <w:t>Bulan ke-59 s/d 60</w:t>
+            </w:r>
+          </w:p>
+          <w:p>
+            <w:pPr/>
+            <w:r>
+              <w:rPr>
+                <w:rFonts w:ascii="Arial" w:hAnsi="Arial"/>
+                <w:sz w:val="19"/>
+              </w:rPr>
+              <w:t>(Peringatan Kritis Kedaluwarsa)</w:t>
+            </w:r>
+          </w:p>
+        </w:tc>
+        <w:tc>
+          <w:tcPr>
+            <w:tcW w:w="1600" w:type="dxa"/>
+            <w:shd w:val="clear" w:color="auto" w:fill="FFFFFF"/>
+            <w:tcMar>
+              <w:top w:w="100" w:type="dxa"/>
+              <w:bottom w:w="100" w:type="dxa"/>
+              <w:left w:w="140" w:type="dxa"/>
+              <w:right w:w="140" w:type="dxa"/>
+            </w:tcMar>
+          </w:tcPr>
+          <w:p>
+            <w:pPr/>
+            <w:r>
+              <w:rPr>
+                <w:rFonts w:ascii="Arial" w:hAnsi="Arial"/>
+                <w:sz w:val="19"/>
+              </w:rPr>
+              <w:t>Masa Tenggang 6 Bulan</w:t>
+            </w:r>
+          </w:p>
+          <w:p>
+            <w:pPr/>
+            <w:r>
+              <w:rPr>
+                <w:rFonts w:ascii="Arial" w:hAnsi="Arial"/>
+                <w:sz w:val="19"/>
+              </w:rPr>
+              <w:t>(Bulan ke-60 s/d Bulan ke-66)</w:t>
+            </w:r>
+          </w:p>
+        </w:tc>
+        <w:tc>
+          <w:tcPr>
+            <w:tcW w:w="1600" w:type="dxa"/>
+            <w:shd w:val="clear" w:color="auto" w:fill="FFFFFF"/>
+            <w:tcMar>
+              <w:top w:w="100" w:type="dxa"/>
+              <w:bottom w:w="100" w:type="dxa"/>
+              <w:left w:w="140" w:type="dxa"/>
+              <w:right w:w="140" w:type="dxa"/>
+            </w:tcMar>
+          </w:tcPr>
+          <w:p>
+            <w:pPr/>
+            <w:r>
+              <w:rPr>
+                <w:rFonts w:ascii="Arial" w:hAnsi="Arial"/>
+                <w:sz w:val="19"/>
+              </w:rPr>
+              <w:t>Maksimal Bulan ke-66</w:t>
+            </w:r>
+          </w:p>
+          <w:p>
+            <w:pPr/>
+            <w:r>
+              <w:rPr>
+                <w:rFonts w:ascii="Arial" w:hAnsi="Arial"/>
+                <w:sz w:val="19"/>
+              </w:rPr>
+              <w:t>(6 Bulan Pasca-Kedaluwarsa)</w:t>
+            </w:r>
+          </w:p>
+        </w:tc>
+        <w:tc>
+          <w:tcPr>
+            <w:tcW w:w="3500" w:type="dxa"/>
+            <w:shd w:val="clear" w:color="auto" w:fill="FFFFFF"/>
+            <w:tcMar>
+              <w:top w:w="100" w:type="dxa"/>
+              <w:bottom w:w="100" w:type="dxa"/>
+              <w:left w:w="140" w:type="dxa"/>
+              <w:right w:w="140" w:type="dxa"/>
+            </w:tcMar>
+          </w:tcPr>
+          <w:p>
+            <w:pPr/>
+            <w:r>
+              <w:rPr>
+                <w:rFonts w:ascii="Arial" w:hAnsi="Arial"/>
+                <w:sz w:val="19"/>
+              </w:rPr>
+              <w:t>Prasyarat Mutlak Grace Period: Laboratorium WAJIB sudah melaksanakan asesmen lapangan RA sebelum siklus 5 tahun berakhir. Selama 6 bulan masa tenggang, hak penggunaan simbol/logo KAN dibekukan sementara hingga SK baru terbit. Jika dalam 6 bulan SK belum rampung, akreditasi otomatis DICABUT (REVOKED). Apabila hingga Bulan ke-60 laboratorium sama sekali belum melaksanakan asesmen RA, status akreditasi langsung DICABUT SEKETIKA tanpa fasilitas masa tenggang.</w:t>
             </w:r>
           </w:p>
         </w:tc>
@@ -4873,22 +5229,22 @@
       </w:pPr>
       <w:r>
         <w:drawing>
-          <wp:inline xmlns:wp="http://schemas.openxmlformats.org/drawingml/2006/wordprocessingDrawing" distT="0" distB="0" distL="0" distR="0">
+          <wp:inline distT="0" distB="0" distL="0" distR="0">
             <wp:extent cx="5500000" cy="2538000"/>
             <wp:effectExtent l="0" t="0" r="0" b="0"/>
             <wp:docPr id="6" name="Gambar 6. 2 Alur Kerja Asesmen Lapangan, Siklus Tindakan Perbaikan (TP/VTP) &amp; Penerbitan SK"/>
             <wp:cNvGraphicFramePr>
-              <a:graphicFrameLocks xmlns:a="http://schemas.openxmlformats.org/drawingml/2006/main" noChangeAspect="1"/>
+              <a:graphicFrameLocks noChangeAspect="1"/>
             </wp:cNvGraphicFramePr>
-            <a:graphic xmlns:a="http://schemas.openxmlformats.org/drawingml/2006/main">
+            <a:graphic>
               <a:graphicData uri="http://schemas.openxmlformats.org/drawingml/2006/picture">
-                <pic:pic xmlns:pic="http://schemas.openxmlformats.org/drawingml/2006/picture">
+                <pic:pic>
                   <pic:nvPicPr>
                     <pic:cNvPr id="0" name="diagram_asesmen_tp_sk.png"/>
                     <pic:cNvPicPr/>
                   </pic:nvPicPr>
                   <pic:blipFill>
-                    <a:blip xmlns:r="http://schemas.openxmlformats.org/officeDocument/2006/relationships" r:embed="rIdImg6"/>
+                    <a:blip r:embed="rIdImg6"/>
                     <a:stretch>
                       <a:fillRect/>
                     </a:stretch>
@@ -5173,22 +5529,22 @@
       </w:pPr>
       <w:r>
         <w:drawing>
-          <wp:inline xmlns:wp="http://schemas.openxmlformats.org/drawingml/2006/wordprocessingDrawing" distT="0" distB="0" distL="0" distR="0">
+          <wp:inline distT="0" distB="0" distL="0" distR="0">
             <wp:extent cx="5400000" cy="8660000"/>
             <wp:effectExtent l="0" t="0" r="0" b="0"/>
             <wp:docPr id="7" name="Gambar 6. 3 Diagram Alur Kerja Aktivitas PIC dalam 1 Siklus Akreditasi Penuh (8 Tahapan KAN U-01)"/>
             <wp:cNvGraphicFramePr>
-              <a:graphicFrameLocks xmlns:a="http://schemas.openxmlformats.org/drawingml/2006/main" noChangeAspect="1"/>
+              <a:graphicFrameLocks noChangeAspect="1"/>
             </wp:cNvGraphicFramePr>
-            <a:graphic xmlns:a="http://schemas.openxmlformats.org/drawingml/2006/main">
+            <a:graphic>
               <a:graphicData uri="http://schemas.openxmlformats.org/drawingml/2006/picture">
-                <pic:pic xmlns:pic="http://schemas.openxmlformats.org/drawingml/2006/picture">
+                <pic:pic>
                   <pic:nvPicPr>
                     <pic:cNvPr id="0" name="diagram_workflow_pic_siklus.png"/>
                     <pic:cNvPicPr/>
                   </pic:nvPicPr>
                   <pic:blipFill>
-                    <a:blip xmlns:r="http://schemas.openxmlformats.org/officeDocument/2006/relationships" r:embed="rIdImg7"/>
+                    <a:blip r:embed="rIdImg7"/>
                     <a:stretch>
                       <a:fillRect/>
                     </a:stretch>
@@ -19376,22 +19732,22 @@
       </w:pPr>
       <w:r>
         <w:drawing>
-          <wp:inline xmlns:wp="http://schemas.openxmlformats.org/drawingml/2006/wordprocessingDrawing" distT="0" distB="0" distL="0" distR="0">
+          <wp:inline distT="0" distB="0" distL="0" distR="0">
             <wp:extent cx="5400000" cy="1557000"/>
             <wp:effectExtent l="0" t="0" r="0" b="0"/>
             <wp:docPr id="8" name="Gambar 8. 1 Matriks Kategori Warna Kalender Pengawasan SIMASADI"/>
             <wp:cNvGraphicFramePr>
-              <a:graphicFrameLocks xmlns:a="http://schemas.openxmlformats.org/drawingml/2006/main" noChangeAspect="1"/>
+              <a:graphicFrameLocks noChangeAspect="1"/>
             </wp:cNvGraphicFramePr>
-            <a:graphic xmlns:a="http://schemas.openxmlformats.org/drawingml/2006/main">
+            <a:graphic>
               <a:graphicData uri="http://schemas.openxmlformats.org/drawingml/2006/picture">
-                <pic:pic xmlns:pic="http://schemas.openxmlformats.org/drawingml/2006/picture">
+                <pic:pic>
                   <pic:nvPicPr>
                     <pic:cNvPr id="0" name="diagram_skema_warna.png"/>
                     <pic:cNvPicPr/>
                   </pic:nvPicPr>
                   <pic:blipFill>
-                    <a:blip xmlns:r="http://schemas.openxmlformats.org/officeDocument/2006/relationships" r:embed="rIdImg8"/>
+                    <a:blip r:embed="rIdImg8"/>
                     <a:stretch>
                       <a:fillRect/>
                     </a:stretch>

</xml_diff>

<commit_message>
docs: synchronize all markdown and docx documentation with latest architecture, UX, and test suites
</commit_message>
<xml_diff>
--- a/docs/DOKUMENTASI_ARSITEKTUR_APLIKASI.docx
+++ b/docs/DOKUMENTASI_ARSITEKTUR_APLIKASI.docx
@@ -567,17 +567,8 @@
             </w:tcMar>
           </w:tcPr>
           <w:p>
-            <w:pPr>
-              <w:jc w:val="left"/>
-              <w:spacing w:before="0" w:after="0" w:line="240" w:lineRule="auto"/>
-            </w:pPr>
-            <w:r>
-              <w:rPr>
-                <w:rFonts w:ascii="Calibri" w:hAnsi="Calibri"/>
-                <w:color w:val="000000"/>
-                <w:sz w:val="18"/>
-              </w:rPr>
-              <w:t>183/183 Automated Tests Passing (1.102 Asersi, 100% Lulus Uji Regulasi KAN, Batas Waktu TP, dan Multi-Akun)</w:t>
+            <w:r>
+              <w:t>183 Backend Tests + 8 Frontend Tests Passing (1.102 Asersi, 100% Lulus Uji Regulasi KAN, Batas Waktu TP, dan Multi-Akun RBAC)</w:t>
             </w:r>
           </w:p>
         </w:tc>
@@ -1331,17 +1322,8 @@
             </w:tcMar>
           </w:tcPr>
           <w:p>
-            <w:pPr>
-              <w:jc w:val="left"/>
-              <w:spacing w:before="0" w:after="0" w:line="240" w:lineRule="auto"/>
-            </w:pPr>
-            <w:r>
-              <w:rPr>
-                <w:rFonts w:ascii="Calibri" w:hAnsi="Calibri"/>
-                <w:color w:val="000000"/>
-                <w:sz w:val="18"/>
-              </w:rPr>
-              <w:t>PHPUnit 11</w:t>
+            <w:r>
+              <w:t>PHPUnit 11 &amp; Node.js Test Runner</w:t>
             </w:r>
           </w:p>
         </w:tc>
@@ -1357,17 +1339,8 @@
             </w:tcMar>
           </w:tcPr>
           <w:p>
-            <w:pPr>
-              <w:jc w:val="both"/>
-              <w:spacing w:before="0" w:after="0" w:line="240" w:lineRule="auto"/>
-            </w:pPr>
-            <w:r>
-              <w:rPr>
-                <w:rFonts w:ascii="Calibri" w:hAnsi="Calibri"/>
-                <w:color w:val="000000"/>
-                <w:sz w:val="18"/>
-              </w:rPr>
-              <w:t>Memastikan keandalan seluruh fungsi sistem dengan 183 kasus uji otomatis terverifikasi (100% lulus, 1.102 assertions).</w:t>
+            <w:r>
+              <w:t>Memastikan keandalan seluruh fungsi sistem dengan 183 kasus uji backend PHPUnit (1.102 assertions) dan 8 kasus uji frontend Node.js untuk router cache &amp; datatable parser (100% lulus).</w:t>
             </w:r>
           </w:p>
         </w:tc>
@@ -20587,12 +20560,7 @@
         <w:spacing w:before="60" w:after="140" w:line="276" w:lineRule="auto"/>
       </w:pPr>
       <w:r>
-        <w:rPr>
-          <w:rFonts w:ascii="Calibri" w:hAnsi="Calibri"/>
-          <w:color w:val="000000"/>
-          <w:sz w:val="21"/>
-        </w:rPr>
-        <w:t xml:space="preserve">Mendukung unggah berkas CSV, berkas spreadsheet XLSX, dan live sync Google Sheets. Sistem memetakan nomor registrasi LPK dan tipe asesmen secara otomatis serta melakukan pembaruan profil tanpa menimbulkan duplikasi data.</w:t>
+        <w:t>Mendukung unggah berkas CSV, berkas spreadsheet XLSX, dan live sync Google Sheets. Sistem memetakan nomor registrasi LPK dan tipe asesmen secara otomatis, memvalidasi otorisasi hak kelola laboratorium (manageableBy), membetulkan durasi terbalik (inverted dates clamping), serta melakukan pembaruan profil tanpa menimbulkan duplikasi data.</w:t>
       </w:r>
     </w:p>
     <w:p>
@@ -20647,12 +20615,7 @@
         <w:spacing w:before="60" w:after="140" w:line="276" w:lineRule="auto"/>
       </w:pPr>
       <w:r>
-        <w:rPr>
-          <w:rFonts w:ascii="Calibri" w:hAnsi="Calibri"/>
-          <w:color w:val="000000"/>
-          <w:sz w:val="21"/>
-        </w:rPr>
-        <w:t xml:space="preserve">Tampilan visual kalender bulanan interaktif dengan pengelompokan 5 kategori warna event. Dilengkapi navigasi langsung bulan dan tahun dinamis, modal tambah cepat (quick-add) saat kotak tanggal diklik, dan filter multi-kriteria.</w:t>
+        <w:t>Tampilan visual kalender bulanan interaktif dengan pengelompokan 5 kategori warna event. Dilengkapi navigasi langsung bulan dan tahun dinamis, modal tambah cepat (quick-add) saat kotak tanggal diklik, filter multi-kriteria, serta pembatasan rentang kueri historis TP (whereBetween &amp; subMonths(5)) untuk menjamin efisiensi memori server.</w:t>
       </w:r>
     </w:p>
     <w:p>
@@ -20767,12 +20730,7 @@
         <w:spacing w:before="60" w:after="140" w:line="276" w:lineRule="auto"/>
       </w:pPr>
       <w:r>
-        <w:rPr>
-          <w:rFonts w:ascii="Calibri" w:hAnsi="Calibri"/>
-          <w:color w:val="000000"/>
-          <w:sz w:val="21"/>
-        </w:rPr>
-        <w:t xml:space="preserve">Menyediakan sakelar tema instan (light/dark mode) di bilah navigasi atas tanpa reload halaman, persistensi localStorage, deteksi otomatis preferensi sistem operasi, script anti-kedip (anti-flicker) di tag head, dan harmonisasi bentuk squircle pada navbar dan avatar pengguna.</w:t>
+        <w:t>Menyediakan sakelar tema instan (light/dark mode) di bilah navigasi atas tanpa reload halaman, persistensi localStorage, deteksi otomatis preferensi sistem operasi, script anti-kedip (anti-flicker) di tag head, harmonisasi bentuk squircle pada navbar dan avatar pengguna, standarisasi tombol kembali taktil ber-radius 10px (var(--radius-md)), navigasi ponsel modern Bottom Navigation Bar (.bottom-nav) dengan lembar aksi cepat, serta canvas login gradien biru primer (#1972f5 ke #0456ce) pada tema terang.</w:t>
       </w:r>
     </w:p>
     <w:p>
@@ -22105,21 +22063,7 @@
         <w:ind w:left="240" w:right="120"/>
       </w:pPr>
       <w:r>
-        <w:rPr>
-          <w:rFonts w:ascii="Calibri" w:hAnsi="Calibri"/>
-          <w:b/>
-          <w:color w:val="000000"/>
-          <w:sz w:val="21"/>
-        </w:rPr>
-        <w:t xml:space="preserve">Status Verifikasi Teknis Akhir: </w:t>
-      </w:r>
-      <w:r>
-        <w:rPr>
-          <w:rFonts w:ascii="Calibri" w:hAnsi="Calibri"/>
-          <w:color w:val="000000"/>
-          <w:sz w:val="20"/>
-        </w:rPr>
-        <w:t xml:space="preserve">Seluruh fitur aktif dalam arsitektur ini telah diuji secara komprehensif melalui rangkaian uji otomatis (test suite) PHPUnit dengan hasil 183/183 pengujian sukses (100% lulus tanpa kegagalan, 1.102 assertions).</w:t>
+        <w:t>Status Verifikasi Teknis Akhir: Seluruh fitur aktif dalam arsitektur ini telah diuji secara komprehensif melalui dua lapisan uji otomatis: test suite PHPUnit backend dengan hasil 183/183 pengujian sukses (1.102 assertions, 100% lulus) dan test suite Node.js frontend dengan 8/8 pengujian sukses untuk verifikasi router cache dan penguraian tipe data sel datatable.</w:t>
       </w:r>
     </w:p>
     <w:sectPr>

</xml_diff>